<commit_message>
Deploying to gh-pages from @ Morrison-Lab/mds@cd26045b2e61ef1bf9131ba00b2b2dbab728c412 🚀
</commit_message>
<xml_diff>
--- a/optimization-constrained.docx
+++ b/optimization-constrained.docx
@@ -15,7 +15,7 @@
         <w:pStyle w:val="Date"/>
       </w:pPr>
       <w:r>
-        <w:t xml:space="preserve">Last modified: 2026-10-29 14:56:31 (PDT)</w:t>
+        <w:t xml:space="preserve">Last modified: 2026-10-29 16:45:03 (PDT)</w:t>
       </w:r>
     </w:p>
     <w:bookmarkStart w:id="59" w:name="sec-lagrange"/>
@@ -2944,7 +2944,7 @@
           <w:rPr>
             <w:rStyle w:val="Hyperlink"/>
           </w:rPr>
-          <w:t xml:space="preserve">Definition 3 in Critical Points and Optimality Conditions</w:t>
+          <w:t xml:space="preserve">Definition 4 in Critical Points and Optimality Conditions</w:t>
         </w:r>
       </w:hyperlink>
       <w:r>

</xml_diff>